<commit_message>
Update notebook and report with gamma fix and prediction agreement analysis
</commit_message>
<xml_diff>
--- a/SVM Project.docx
+++ b/SVM Project.docx
@@ -135,7 +135,17 @@
           <w:sz w:val="28"/>
           <w:szCs w:val="28"/>
         </w:rPr>
-        <w:t>April 23</w:t>
+        <w:t xml:space="preserve">April </w:t>
+      </w:r>
+      <w:r>
+        <w:rPr>
+          <w:rFonts w:ascii="Times New Roman" w:hAnsi="Times New Roman" w:cs="Times New Roman"/>
+          <w:b/>
+          <w:bCs/>
+          <w:sz w:val="28"/>
+          <w:szCs w:val="28"/>
+        </w:rPr>
+        <w:t>30</w:t>
       </w:r>
       <w:r>
         <w:rPr>
@@ -146,7 +156,7 @@
           <w:szCs w:val="28"/>
           <w:vertAlign w:val="superscript"/>
         </w:rPr>
-        <w:t>rd</w:t>
+        <w:t>th</w:t>
       </w:r>
       <w:r>
         <w:rPr>
@@ -3044,7 +3054,7 @@
               <w:rPr>
                 <w:rFonts w:ascii="Times New Roman" w:hAnsi="Times New Roman" w:cs="Times New Roman"/>
               </w:rPr>
-              <w:t>0.9930</w:t>
+              <w:t>0.9720</w:t>
             </w:r>
           </w:p>
         </w:tc>
@@ -3062,7 +3072,7 @@
               <w:rPr>
                 <w:rFonts w:ascii="Times New Roman" w:hAnsi="Times New Roman" w:cs="Times New Roman"/>
               </w:rPr>
-              <w:t>56</w:t>
+              <w:t>65</w:t>
             </w:r>
           </w:p>
         </w:tc>
@@ -3340,6 +3350,115 @@
           <w:rFonts w:ascii="Times New Roman" w:hAnsi="Times New Roman" w:cs="Times New Roman"/>
         </w:rPr>
       </w:pPr>
+      <w:r>
+        <w:rPr>
+          <w:rFonts w:ascii="Times New Roman" w:hAnsi="Times New Roman" w:cs="Times New Roman"/>
+        </w:rPr>
+        <w:t xml:space="preserve">As a further validation, the predictions of the scratch and </w:t>
+      </w:r>
+      <w:proofErr w:type="spellStart"/>
+      <w:r>
+        <w:rPr>
+          <w:rFonts w:ascii="Times New Roman" w:hAnsi="Times New Roman" w:cs="Times New Roman"/>
+        </w:rPr>
+        <w:t>sklearn</w:t>
+      </w:r>
+      <w:proofErr w:type="spellEnd"/>
+      <w:r>
+        <w:rPr>
+          <w:rFonts w:ascii="Times New Roman" w:hAnsi="Times New Roman" w:cs="Times New Roman"/>
+        </w:rPr>
+        <w:t xml:space="preserve"> implementations were compared point-by-point on the 143 test patients. The linear and RBF kernels achieved perfect prediction agreement (143/143), confirming both solvers converged to the exact same decision boundary. The polynomial kernel showed agreement on 1</w:t>
+      </w:r>
+      <w:r>
+        <w:rPr>
+          <w:rFonts w:ascii="Times New Roman" w:hAnsi="Times New Roman" w:cs="Times New Roman"/>
+        </w:rPr>
+        <w:t>42</w:t>
+      </w:r>
+      <w:r>
+        <w:rPr>
+          <w:rFonts w:ascii="Times New Roman" w:hAnsi="Times New Roman" w:cs="Times New Roman"/>
+        </w:rPr>
+        <w:t xml:space="preserve">/143 points, with the </w:t>
+      </w:r>
+      <w:r>
+        <w:rPr>
+          <w:rFonts w:ascii="Times New Roman" w:hAnsi="Times New Roman" w:cs="Times New Roman"/>
+        </w:rPr>
+        <w:t>1</w:t>
+      </w:r>
+      <w:r>
+        <w:rPr>
+          <w:rFonts w:ascii="Times New Roman" w:hAnsi="Times New Roman" w:cs="Times New Roman"/>
+        </w:rPr>
+        <w:t xml:space="preserve"> disagreement</w:t>
+      </w:r>
+      <w:r>
+        <w:rPr>
+          <w:rFonts w:ascii="Times New Roman" w:hAnsi="Times New Roman" w:cs="Times New Roman"/>
+        </w:rPr>
+        <w:t xml:space="preserve"> </w:t>
+      </w:r>
+      <w:r>
+        <w:rPr>
+          <w:rFonts w:ascii="Times New Roman" w:hAnsi="Times New Roman" w:cs="Times New Roman"/>
+        </w:rPr>
+        <w:t>consistent with the small accuracy gap between implementations</w:t>
+      </w:r>
+      <w:r>
+        <w:rPr>
+          <w:rFonts w:ascii="Times New Roman" w:hAnsi="Times New Roman" w:cs="Times New Roman"/>
+        </w:rPr>
+        <w:t>,</w:t>
+      </w:r>
+      <w:r>
+        <w:rPr>
+          <w:rFonts w:ascii="Times New Roman" w:hAnsi="Times New Roman" w:cs="Times New Roman"/>
+        </w:rPr>
+        <w:t xml:space="preserve"> a result of numerical differences between </w:t>
+      </w:r>
+      <w:proofErr w:type="spellStart"/>
+      <w:r>
+        <w:rPr>
+          <w:rFonts w:ascii="Times New Roman" w:hAnsi="Times New Roman" w:cs="Times New Roman"/>
+        </w:rPr>
+        <w:t>cvxopt's</w:t>
+      </w:r>
+      <w:proofErr w:type="spellEnd"/>
+      <w:r>
+        <w:rPr>
+          <w:rFonts w:ascii="Times New Roman" w:hAnsi="Times New Roman" w:cs="Times New Roman"/>
+        </w:rPr>
+        <w:t xml:space="preserve"> interior-point method and </w:t>
+      </w:r>
+      <w:proofErr w:type="spellStart"/>
+      <w:r>
+        <w:rPr>
+          <w:rFonts w:ascii="Times New Roman" w:hAnsi="Times New Roman" w:cs="Times New Roman"/>
+        </w:rPr>
+        <w:t>sklearn's</w:t>
+      </w:r>
+      <w:proofErr w:type="spellEnd"/>
+      <w:r>
+        <w:rPr>
+          <w:rFonts w:ascii="Times New Roman" w:hAnsi="Times New Roman" w:cs="Times New Roman"/>
+        </w:rPr>
+        <w:t xml:space="preserve"> SMO algorithm</w:t>
+      </w:r>
+      <w:r>
+        <w:rPr>
+          <w:rFonts w:ascii="Times New Roman" w:hAnsi="Times New Roman" w:cs="Times New Roman"/>
+        </w:rPr>
+        <w:t>.</w:t>
+      </w:r>
+    </w:p>
+    <w:p>
+      <w:pPr>
+        <w:rPr>
+          <w:rFonts w:ascii="Times New Roman" w:hAnsi="Times New Roman" w:cs="Times New Roman"/>
+        </w:rPr>
+      </w:pPr>
     </w:p>
     <w:p>
       <w:pPr>
@@ -3366,6 +3485,7 @@
         <w:rPr>
           <w:rFonts w:ascii="Times New Roman" w:hAnsi="Times New Roman" w:cs="Times New Roman"/>
         </w:rPr>
+        <w:lastRenderedPageBreak/>
         <w:t>For a medical dataset, recall on the malignant class is the most important metric</w:t>
       </w:r>
       <w:r>
@@ -3706,7 +3826,6 @@
         <w:rPr>
           <w:rFonts w:ascii="Times New Roman" w:hAnsi="Times New Roman" w:cs="Times New Roman"/>
         </w:rPr>
-        <w:lastRenderedPageBreak/>
         <w:t>O</w:t>
       </w:r>
       <w:r>
@@ -3772,25 +3891,511 @@
         <w:rPr>
           <w:rFonts w:ascii="Times New Roman" w:hAnsi="Times New Roman" w:cs="Times New Roman"/>
         </w:rPr>
-        <w:t xml:space="preserve"> {0.01, 0.1, 0.5, 1, 5, 10, 100} using the RBF kernel. At low C, many points become support vectors because the wide margin tolerates violations from a large portion of the training set. As C increases, the margin tightens and fewer points are needed to define it</w:t>
-      </w:r>
-      <w:r>
-        <w:rPr>
-          <w:rFonts w:ascii="Times New Roman" w:hAnsi="Times New Roman" w:cs="Times New Roman"/>
-        </w:rPr>
-        <w:t xml:space="preserve">, </w:t>
-      </w:r>
-      <w:r>
-        <w:rPr>
-          <w:rFonts w:ascii="Times New Roman" w:hAnsi="Times New Roman" w:cs="Times New Roman"/>
-        </w:rPr>
-        <w:t>but at very high C the model begins to overfit and test accuracy drops. C = 1 provided the best balance for this dataset.</w:t>
-      </w:r>
-    </w:p>
-    <w:p>
-      <w:pPr>
-        <w:rPr>
-          <w:rFonts w:ascii="Times New Roman" w:hAnsi="Times New Roman" w:cs="Times New Roman"/>
+        <w:t xml:space="preserve"> {0.01, 0.1, 0.5, 1, 5, 10, 100} using the RBF kernel. At low C, many points become support vectors because the wide margin tolerates violations from a large portion of the training set. As C increases, the margin tightens and fewer points are needed to define it. C=5 produced the highest test accuracy at 0.9860, though C=1 offers a comparable 0.9790 with a slightly wider margin, making it a more conservative and generalizable choice. Beyond C=10, accuracy drops noticeably as the model begins to overfit.</w:t>
+      </w:r>
+    </w:p>
+    <w:tbl>
+      <w:tblPr>
+        <w:tblStyle w:val="TableGrid"/>
+        <w:tblW w:w="0" w:type="auto"/>
+        <w:tblLook w:val="04A0" w:firstRow="1" w:lastRow="0" w:firstColumn="1" w:lastColumn="0" w:noHBand="0" w:noVBand="1"/>
+      </w:tblPr>
+      <w:tblGrid>
+        <w:gridCol w:w="3116"/>
+        <w:gridCol w:w="3117"/>
+        <w:gridCol w:w="3117"/>
+      </w:tblGrid>
+      <w:tr>
+        <w:tc>
+          <w:tcPr>
+            <w:tcW w:w="3116" w:type="dxa"/>
+          </w:tcPr>
+          <w:p>
+            <w:pPr>
+              <w:rPr>
+                <w:rFonts w:ascii="Times New Roman" w:hAnsi="Times New Roman" w:cs="Times New Roman"/>
+                <w:b/>
+                <w:bCs/>
+              </w:rPr>
+            </w:pPr>
+            <w:r>
+              <w:rPr>
+                <w:rFonts w:ascii="Times New Roman" w:hAnsi="Times New Roman" w:cs="Times New Roman"/>
+                <w:b/>
+                <w:bCs/>
+              </w:rPr>
+              <w:t>C</w:t>
+            </w:r>
+          </w:p>
+        </w:tc>
+        <w:tc>
+          <w:tcPr>
+            <w:tcW w:w="3117" w:type="dxa"/>
+          </w:tcPr>
+          <w:p>
+            <w:pPr>
+              <w:rPr>
+                <w:rFonts w:ascii="Times New Roman" w:hAnsi="Times New Roman" w:cs="Times New Roman"/>
+                <w:b/>
+                <w:bCs/>
+              </w:rPr>
+            </w:pPr>
+            <w:r>
+              <w:rPr>
+                <w:rFonts w:ascii="Times New Roman" w:hAnsi="Times New Roman" w:cs="Times New Roman"/>
+                <w:b/>
+                <w:bCs/>
+              </w:rPr>
+              <w:t>#</w:t>
+            </w:r>
+            <w:r>
+              <w:rPr>
+                <w:rFonts w:ascii="Times New Roman" w:hAnsi="Times New Roman" w:cs="Times New Roman"/>
+                <w:b/>
+                <w:bCs/>
+              </w:rPr>
+              <w:t xml:space="preserve"> </w:t>
+            </w:r>
+            <w:r>
+              <w:rPr>
+                <w:rFonts w:ascii="Times New Roman" w:hAnsi="Times New Roman" w:cs="Times New Roman"/>
+                <w:b/>
+                <w:bCs/>
+              </w:rPr>
+              <w:t>SV</w:t>
+            </w:r>
+            <w:r>
+              <w:rPr>
+                <w:rFonts w:ascii="Times New Roman" w:hAnsi="Times New Roman" w:cs="Times New Roman"/>
+                <w:b/>
+                <w:bCs/>
+              </w:rPr>
+              <w:t>s</w:t>
+            </w:r>
+          </w:p>
+        </w:tc>
+        <w:tc>
+          <w:tcPr>
+            <w:tcW w:w="3117" w:type="dxa"/>
+          </w:tcPr>
+          <w:p>
+            <w:pPr>
+              <w:rPr>
+                <w:rFonts w:ascii="Times New Roman" w:hAnsi="Times New Roman" w:cs="Times New Roman"/>
+                <w:b/>
+                <w:bCs/>
+              </w:rPr>
+            </w:pPr>
+            <w:r>
+              <w:rPr>
+                <w:rFonts w:ascii="Times New Roman" w:hAnsi="Times New Roman" w:cs="Times New Roman"/>
+                <w:b/>
+                <w:bCs/>
+              </w:rPr>
+              <w:t>Test Accuracy</w:t>
+            </w:r>
+          </w:p>
+        </w:tc>
+      </w:tr>
+      <w:tr>
+        <w:tc>
+          <w:tcPr>
+            <w:tcW w:w="3116" w:type="dxa"/>
+          </w:tcPr>
+          <w:p>
+            <w:pPr>
+              <w:rPr>
+                <w:rFonts w:ascii="Times New Roman" w:hAnsi="Times New Roman" w:cs="Times New Roman"/>
+              </w:rPr>
+            </w:pPr>
+            <w:r>
+              <w:rPr>
+                <w:rFonts w:ascii="Times New Roman" w:hAnsi="Times New Roman" w:cs="Times New Roman"/>
+              </w:rPr>
+              <w:t>0.01</w:t>
+            </w:r>
+          </w:p>
+        </w:tc>
+        <w:tc>
+          <w:tcPr>
+            <w:tcW w:w="3117" w:type="dxa"/>
+          </w:tcPr>
+          <w:p>
+            <w:pPr>
+              <w:rPr>
+                <w:rFonts w:ascii="Times New Roman" w:hAnsi="Times New Roman" w:cs="Times New Roman"/>
+              </w:rPr>
+            </w:pPr>
+            <w:r>
+              <w:rPr>
+                <w:rFonts w:ascii="Times New Roman" w:hAnsi="Times New Roman" w:cs="Times New Roman"/>
+              </w:rPr>
+              <w:t>322</w:t>
+            </w:r>
+          </w:p>
+        </w:tc>
+        <w:tc>
+          <w:tcPr>
+            <w:tcW w:w="3117" w:type="dxa"/>
+          </w:tcPr>
+          <w:p>
+            <w:pPr>
+              <w:rPr>
+                <w:rFonts w:ascii="Times New Roman" w:hAnsi="Times New Roman" w:cs="Times New Roman"/>
+              </w:rPr>
+            </w:pPr>
+            <w:r>
+              <w:rPr>
+                <w:rFonts w:ascii="Times New Roman" w:hAnsi="Times New Roman" w:cs="Times New Roman"/>
+              </w:rPr>
+              <w:t>0.6294</w:t>
+            </w:r>
+          </w:p>
+        </w:tc>
+      </w:tr>
+      <w:tr>
+        <w:tc>
+          <w:tcPr>
+            <w:tcW w:w="3116" w:type="dxa"/>
+          </w:tcPr>
+          <w:p>
+            <w:pPr>
+              <w:rPr>
+                <w:rFonts w:ascii="Times New Roman" w:hAnsi="Times New Roman" w:cs="Times New Roman"/>
+              </w:rPr>
+            </w:pPr>
+            <w:r>
+              <w:rPr>
+                <w:rFonts w:ascii="Times New Roman" w:hAnsi="Times New Roman" w:cs="Times New Roman"/>
+              </w:rPr>
+              <w:t>0.1</w:t>
+            </w:r>
+          </w:p>
+        </w:tc>
+        <w:tc>
+          <w:tcPr>
+            <w:tcW w:w="3117" w:type="dxa"/>
+          </w:tcPr>
+          <w:p>
+            <w:pPr>
+              <w:rPr>
+                <w:rFonts w:ascii="Times New Roman" w:hAnsi="Times New Roman" w:cs="Times New Roman"/>
+              </w:rPr>
+            </w:pPr>
+            <w:r>
+              <w:rPr>
+                <w:rFonts w:ascii="Times New Roman" w:hAnsi="Times New Roman" w:cs="Times New Roman"/>
+              </w:rPr>
+              <w:t>189</w:t>
+            </w:r>
+          </w:p>
+        </w:tc>
+        <w:tc>
+          <w:tcPr>
+            <w:tcW w:w="3117" w:type="dxa"/>
+          </w:tcPr>
+          <w:p>
+            <w:pPr>
+              <w:rPr>
+                <w:rFonts w:ascii="Times New Roman" w:hAnsi="Times New Roman" w:cs="Times New Roman"/>
+              </w:rPr>
+            </w:pPr>
+            <w:r>
+              <w:rPr>
+                <w:rFonts w:ascii="Times New Roman" w:hAnsi="Times New Roman" w:cs="Times New Roman"/>
+              </w:rPr>
+              <w:t>0.9371</w:t>
+            </w:r>
+          </w:p>
+        </w:tc>
+      </w:tr>
+      <w:tr>
+        <w:tc>
+          <w:tcPr>
+            <w:tcW w:w="3116" w:type="dxa"/>
+          </w:tcPr>
+          <w:p>
+            <w:pPr>
+              <w:rPr>
+                <w:rFonts w:ascii="Times New Roman" w:hAnsi="Times New Roman" w:cs="Times New Roman"/>
+              </w:rPr>
+            </w:pPr>
+            <w:r>
+              <w:rPr>
+                <w:rFonts w:ascii="Times New Roman" w:hAnsi="Times New Roman" w:cs="Times New Roman"/>
+              </w:rPr>
+              <w:t>0.5</w:t>
+            </w:r>
+          </w:p>
+        </w:tc>
+        <w:tc>
+          <w:tcPr>
+            <w:tcW w:w="3117" w:type="dxa"/>
+          </w:tcPr>
+          <w:p>
+            <w:pPr>
+              <w:rPr>
+                <w:rFonts w:ascii="Times New Roman" w:hAnsi="Times New Roman" w:cs="Times New Roman"/>
+              </w:rPr>
+            </w:pPr>
+            <w:r>
+              <w:rPr>
+                <w:rFonts w:ascii="Times New Roman" w:hAnsi="Times New Roman" w:cs="Times New Roman"/>
+              </w:rPr>
+              <w:t>116</w:t>
+            </w:r>
+          </w:p>
+        </w:tc>
+        <w:tc>
+          <w:tcPr>
+            <w:tcW w:w="3117" w:type="dxa"/>
+          </w:tcPr>
+          <w:p>
+            <w:pPr>
+              <w:rPr>
+                <w:rFonts w:ascii="Times New Roman" w:hAnsi="Times New Roman" w:cs="Times New Roman"/>
+              </w:rPr>
+            </w:pPr>
+            <w:r>
+              <w:rPr>
+                <w:rFonts w:ascii="Times New Roman" w:hAnsi="Times New Roman" w:cs="Times New Roman"/>
+              </w:rPr>
+              <w:t>0.9720</w:t>
+            </w:r>
+          </w:p>
+        </w:tc>
+      </w:tr>
+      <w:tr>
+        <w:tc>
+          <w:tcPr>
+            <w:tcW w:w="3116" w:type="dxa"/>
+          </w:tcPr>
+          <w:p>
+            <w:pPr>
+              <w:rPr>
+                <w:rFonts w:ascii="Times New Roman" w:hAnsi="Times New Roman" w:cs="Times New Roman"/>
+              </w:rPr>
+            </w:pPr>
+            <w:r>
+              <w:rPr>
+                <w:rFonts w:ascii="Times New Roman" w:hAnsi="Times New Roman" w:cs="Times New Roman"/>
+              </w:rPr>
+              <w:t>1</w:t>
+            </w:r>
+          </w:p>
+        </w:tc>
+        <w:tc>
+          <w:tcPr>
+            <w:tcW w:w="3117" w:type="dxa"/>
+          </w:tcPr>
+          <w:p>
+            <w:pPr>
+              <w:rPr>
+                <w:rFonts w:ascii="Times New Roman" w:hAnsi="Times New Roman" w:cs="Times New Roman"/>
+              </w:rPr>
+            </w:pPr>
+            <w:r>
+              <w:rPr>
+                <w:rFonts w:ascii="Times New Roman" w:hAnsi="Times New Roman" w:cs="Times New Roman"/>
+              </w:rPr>
+              <w:t>95</w:t>
+            </w:r>
+          </w:p>
+        </w:tc>
+        <w:tc>
+          <w:tcPr>
+            <w:tcW w:w="3117" w:type="dxa"/>
+          </w:tcPr>
+          <w:p>
+            <w:pPr>
+              <w:rPr>
+                <w:rFonts w:ascii="Times New Roman" w:hAnsi="Times New Roman" w:cs="Times New Roman"/>
+              </w:rPr>
+            </w:pPr>
+            <w:r>
+              <w:rPr>
+                <w:rFonts w:ascii="Times New Roman" w:hAnsi="Times New Roman" w:cs="Times New Roman"/>
+              </w:rPr>
+              <w:t>0.9790</w:t>
+            </w:r>
+          </w:p>
+        </w:tc>
+      </w:tr>
+      <w:tr>
+        <w:tc>
+          <w:tcPr>
+            <w:tcW w:w="3116" w:type="dxa"/>
+          </w:tcPr>
+          <w:p>
+            <w:pPr>
+              <w:rPr>
+                <w:rFonts w:ascii="Times New Roman" w:hAnsi="Times New Roman" w:cs="Times New Roman"/>
+              </w:rPr>
+            </w:pPr>
+            <w:r>
+              <w:rPr>
+                <w:rFonts w:ascii="Times New Roman" w:hAnsi="Times New Roman" w:cs="Times New Roman"/>
+              </w:rPr>
+              <w:t>5</w:t>
+            </w:r>
+          </w:p>
+        </w:tc>
+        <w:tc>
+          <w:tcPr>
+            <w:tcW w:w="3117" w:type="dxa"/>
+          </w:tcPr>
+          <w:p>
+            <w:pPr>
+              <w:rPr>
+                <w:rFonts w:ascii="Times New Roman" w:hAnsi="Times New Roman" w:cs="Times New Roman"/>
+              </w:rPr>
+            </w:pPr>
+            <w:r>
+              <w:rPr>
+                <w:rFonts w:ascii="Times New Roman" w:hAnsi="Times New Roman" w:cs="Times New Roman"/>
+              </w:rPr>
+              <w:t>77</w:t>
+            </w:r>
+          </w:p>
+        </w:tc>
+        <w:tc>
+          <w:tcPr>
+            <w:tcW w:w="3117" w:type="dxa"/>
+          </w:tcPr>
+          <w:p>
+            <w:pPr>
+              <w:rPr>
+                <w:rFonts w:ascii="Times New Roman" w:hAnsi="Times New Roman" w:cs="Times New Roman"/>
+              </w:rPr>
+            </w:pPr>
+            <w:r>
+              <w:rPr>
+                <w:rFonts w:ascii="Times New Roman" w:hAnsi="Times New Roman" w:cs="Times New Roman"/>
+              </w:rPr>
+              <w:t>0.9860</w:t>
+            </w:r>
+          </w:p>
+        </w:tc>
+      </w:tr>
+      <w:tr>
+        <w:tc>
+          <w:tcPr>
+            <w:tcW w:w="3116" w:type="dxa"/>
+          </w:tcPr>
+          <w:p>
+            <w:pPr>
+              <w:rPr>
+                <w:rFonts w:ascii="Times New Roman" w:hAnsi="Times New Roman" w:cs="Times New Roman"/>
+              </w:rPr>
+            </w:pPr>
+            <w:r>
+              <w:rPr>
+                <w:rFonts w:ascii="Times New Roman" w:hAnsi="Times New Roman" w:cs="Times New Roman"/>
+              </w:rPr>
+              <w:t>10</w:t>
+            </w:r>
+          </w:p>
+        </w:tc>
+        <w:tc>
+          <w:tcPr>
+            <w:tcW w:w="3117" w:type="dxa"/>
+          </w:tcPr>
+          <w:p>
+            <w:pPr>
+              <w:rPr>
+                <w:rFonts w:ascii="Times New Roman" w:hAnsi="Times New Roman" w:cs="Times New Roman"/>
+              </w:rPr>
+            </w:pPr>
+            <w:r>
+              <w:rPr>
+                <w:rFonts w:ascii="Times New Roman" w:hAnsi="Times New Roman" w:cs="Times New Roman"/>
+              </w:rPr>
+              <w:t>74</w:t>
+            </w:r>
+          </w:p>
+        </w:tc>
+        <w:tc>
+          <w:tcPr>
+            <w:tcW w:w="3117" w:type="dxa"/>
+          </w:tcPr>
+          <w:p>
+            <w:pPr>
+              <w:rPr>
+                <w:rFonts w:ascii="Times New Roman" w:hAnsi="Times New Roman" w:cs="Times New Roman"/>
+              </w:rPr>
+            </w:pPr>
+            <w:r>
+              <w:rPr>
+                <w:rFonts w:ascii="Times New Roman" w:hAnsi="Times New Roman" w:cs="Times New Roman"/>
+              </w:rPr>
+              <w:t>0.9790</w:t>
+            </w:r>
+          </w:p>
+        </w:tc>
+      </w:tr>
+      <w:tr>
+        <w:tc>
+          <w:tcPr>
+            <w:tcW w:w="3116" w:type="dxa"/>
+          </w:tcPr>
+          <w:p>
+            <w:pPr>
+              <w:rPr>
+                <w:rFonts w:ascii="Times New Roman" w:hAnsi="Times New Roman" w:cs="Times New Roman"/>
+              </w:rPr>
+            </w:pPr>
+            <w:r>
+              <w:rPr>
+                <w:rFonts w:ascii="Times New Roman" w:hAnsi="Times New Roman" w:cs="Times New Roman"/>
+              </w:rPr>
+              <w:t>100</w:t>
+            </w:r>
+          </w:p>
+        </w:tc>
+        <w:tc>
+          <w:tcPr>
+            <w:tcW w:w="3117" w:type="dxa"/>
+          </w:tcPr>
+          <w:p>
+            <w:pPr>
+              <w:rPr>
+                <w:rFonts w:ascii="Times New Roman" w:hAnsi="Times New Roman" w:cs="Times New Roman"/>
+              </w:rPr>
+            </w:pPr>
+            <w:r>
+              <w:rPr>
+                <w:rFonts w:ascii="Times New Roman" w:hAnsi="Times New Roman" w:cs="Times New Roman"/>
+              </w:rPr>
+              <w:t>67</w:t>
+            </w:r>
+          </w:p>
+        </w:tc>
+        <w:tc>
+          <w:tcPr>
+            <w:tcW w:w="3117" w:type="dxa"/>
+          </w:tcPr>
+          <w:p>
+            <w:pPr>
+              <w:rPr>
+                <w:rFonts w:ascii="Times New Roman" w:hAnsi="Times New Roman" w:cs="Times New Roman"/>
+              </w:rPr>
+            </w:pPr>
+            <w:r>
+              <w:rPr>
+                <w:rFonts w:ascii="Times New Roman" w:hAnsi="Times New Roman" w:cs="Times New Roman"/>
+              </w:rPr>
+              <w:t>0.9441</w:t>
+            </w:r>
+          </w:p>
+        </w:tc>
+      </w:tr>
+    </w:tbl>
+    <w:p>
+      <w:pPr>
+        <w:rPr>
+          <w:rFonts w:ascii="Times New Roman" w:hAnsi="Times New Roman" w:cs="Times New Roman"/>
+          <w:b/>
+          <w:bCs/>
         </w:rPr>
       </w:pPr>
     </w:p>
@@ -3843,7 +4448,7 @@
         <w:rPr>
           <w:rFonts w:ascii="Times New Roman" w:hAnsi="Times New Roman" w:cs="Times New Roman"/>
         </w:rPr>
-        <w:t xml:space="preserve"> the top features push toward the malignant class (negative weights), with mean compactness being the strongest benign indicator. This is consistent with medical knowledge that irregular, larger cell nuclei are associated with malignancy."</w:t>
+        <w:t xml:space="preserve"> the top features push toward the malignant class (negative weights), with mean compactness being the strongest benign indicator. This is consistent with medical knowledge that irregular, larger cell nuclei are associated with malignancy.</w:t>
       </w:r>
     </w:p>
     <w:p>
@@ -4202,6 +4807,276 @@
         </w:rPr>
         <w:t>, though the speed gap confirms why specialised solvers like SMO are used in production systems.</w:t>
       </w:r>
+    </w:p>
+    <w:p>
+      <w:pPr>
+        <w:rPr>
+          <w:rFonts w:ascii="Times New Roman" w:hAnsi="Times New Roman" w:cs="Times New Roman"/>
+        </w:rPr>
+      </w:pPr>
+    </w:p>
+    <w:p>
+      <w:pPr>
+        <w:rPr>
+          <w:rFonts w:ascii="Times New Roman" w:hAnsi="Times New Roman" w:cs="Times New Roman"/>
+          <w:b/>
+          <w:bCs/>
+        </w:rPr>
+      </w:pPr>
+    </w:p>
+    <w:p>
+      <w:pPr>
+        <w:rPr>
+          <w:rFonts w:ascii="Times New Roman" w:hAnsi="Times New Roman" w:cs="Times New Roman"/>
+          <w:b/>
+          <w:bCs/>
+        </w:rPr>
+      </w:pPr>
+    </w:p>
+    <w:p>
+      <w:pPr>
+        <w:rPr>
+          <w:rFonts w:ascii="Times New Roman" w:hAnsi="Times New Roman" w:cs="Times New Roman"/>
+          <w:b/>
+          <w:bCs/>
+        </w:rPr>
+      </w:pPr>
+    </w:p>
+    <w:p>
+      <w:pPr>
+        <w:rPr>
+          <w:rFonts w:ascii="Times New Roman" w:hAnsi="Times New Roman" w:cs="Times New Roman"/>
+          <w:b/>
+          <w:bCs/>
+        </w:rPr>
+      </w:pPr>
+    </w:p>
+    <w:p>
+      <w:pPr>
+        <w:rPr>
+          <w:rFonts w:ascii="Times New Roman" w:hAnsi="Times New Roman" w:cs="Times New Roman"/>
+          <w:b/>
+          <w:bCs/>
+        </w:rPr>
+      </w:pPr>
+    </w:p>
+    <w:p>
+      <w:pPr>
+        <w:rPr>
+          <w:rFonts w:ascii="Times New Roman" w:hAnsi="Times New Roman" w:cs="Times New Roman"/>
+          <w:b/>
+          <w:bCs/>
+        </w:rPr>
+      </w:pPr>
+    </w:p>
+    <w:p>
+      <w:pPr>
+        <w:rPr>
+          <w:rFonts w:ascii="Times New Roman" w:hAnsi="Times New Roman" w:cs="Times New Roman"/>
+          <w:b/>
+          <w:bCs/>
+        </w:rPr>
+      </w:pPr>
+    </w:p>
+    <w:p>
+      <w:pPr>
+        <w:rPr>
+          <w:rFonts w:ascii="Times New Roman" w:hAnsi="Times New Roman" w:cs="Times New Roman"/>
+          <w:b/>
+          <w:bCs/>
+        </w:rPr>
+      </w:pPr>
+    </w:p>
+    <w:p>
+      <w:pPr>
+        <w:rPr>
+          <w:rFonts w:ascii="Times New Roman" w:hAnsi="Times New Roman" w:cs="Times New Roman"/>
+          <w:b/>
+          <w:bCs/>
+        </w:rPr>
+      </w:pPr>
+    </w:p>
+    <w:p>
+      <w:pPr>
+        <w:rPr>
+          <w:rFonts w:ascii="Times New Roman" w:hAnsi="Times New Roman" w:cs="Times New Roman"/>
+          <w:b/>
+          <w:bCs/>
+        </w:rPr>
+      </w:pPr>
+    </w:p>
+    <w:p>
+      <w:pPr>
+        <w:rPr>
+          <w:rFonts w:ascii="Times New Roman" w:hAnsi="Times New Roman" w:cs="Times New Roman"/>
+          <w:b/>
+          <w:bCs/>
+        </w:rPr>
+      </w:pPr>
+    </w:p>
+    <w:p>
+      <w:pPr>
+        <w:rPr>
+          <w:rFonts w:ascii="Times New Roman" w:hAnsi="Times New Roman" w:cs="Times New Roman"/>
+          <w:b/>
+          <w:bCs/>
+        </w:rPr>
+      </w:pPr>
+    </w:p>
+    <w:p>
+      <w:pPr>
+        <w:rPr>
+          <w:rFonts w:ascii="Times New Roman" w:hAnsi="Times New Roman" w:cs="Times New Roman"/>
+          <w:b/>
+          <w:bCs/>
+        </w:rPr>
+      </w:pPr>
+    </w:p>
+    <w:p>
+      <w:pPr>
+        <w:rPr>
+          <w:rFonts w:ascii="Times New Roman" w:hAnsi="Times New Roman" w:cs="Times New Roman"/>
+          <w:b/>
+          <w:bCs/>
+        </w:rPr>
+      </w:pPr>
+    </w:p>
+    <w:p>
+      <w:pPr>
+        <w:rPr>
+          <w:rFonts w:ascii="Times New Roman" w:hAnsi="Times New Roman" w:cs="Times New Roman"/>
+          <w:b/>
+          <w:bCs/>
+        </w:rPr>
+      </w:pPr>
+    </w:p>
+    <w:p>
+      <w:pPr>
+        <w:rPr>
+          <w:rFonts w:ascii="Times New Roman" w:hAnsi="Times New Roman" w:cs="Times New Roman"/>
+          <w:b/>
+          <w:bCs/>
+        </w:rPr>
+      </w:pPr>
+      <w:r>
+        <w:rPr>
+          <w:rFonts w:ascii="Times New Roman" w:hAnsi="Times New Roman" w:cs="Times New Roman"/>
+          <w:b/>
+          <w:bCs/>
+        </w:rPr>
+        <w:lastRenderedPageBreak/>
+        <w:t>References</w:t>
+      </w:r>
+    </w:p>
+    <w:p>
+      <w:pPr>
+        <w:rPr>
+          <w:rFonts w:ascii="Times New Roman" w:hAnsi="Times New Roman" w:cs="Times New Roman"/>
+        </w:rPr>
+      </w:pPr>
+      <w:r>
+        <w:rPr>
+          <w:rFonts w:ascii="Times New Roman" w:hAnsi="Times New Roman" w:cs="Times New Roman"/>
+        </w:rPr>
+        <w:t xml:space="preserve">M. Andersen, J. Dahl, and L. Vandenberghe, "CVXOPT: A Python package for convex optimization," Version 1.3, 2023. Available at: </w:t>
+      </w:r>
+      <w:hyperlink r:id="rId10" w:tgtFrame="_blank" w:history="1">
+        <w:r>
+          <w:rPr>
+            <w:rStyle w:val="Hyperlink"/>
+            <w:rFonts w:ascii="Times New Roman" w:hAnsi="Times New Roman" w:cs="Times New Roman"/>
+          </w:rPr>
+          <w:t>https://cvxopt.org/</w:t>
+        </w:r>
+      </w:hyperlink>
+    </w:p>
+    <w:p>
+      <w:pPr>
+        <w:rPr>
+          <w:rFonts w:ascii="Times New Roman" w:hAnsi="Times New Roman" w:cs="Times New Roman"/>
+        </w:rPr>
+      </w:pPr>
+      <w:r>
+        <w:rPr>
+          <w:rFonts w:ascii="Times New Roman" w:hAnsi="Times New Roman" w:cs="Times New Roman"/>
+        </w:rPr>
+        <w:t xml:space="preserve">W. H. Wolberg, W. N. Street, and O. L. Mangasarian, "Breast Cancer Wisconsin (Diagnostic) Data Set," UCI Machine Learning Repository, 1995. Available at: </w:t>
+      </w:r>
+      <w:hyperlink r:id="rId11" w:tgtFrame="_blank" w:history="1">
+        <w:r>
+          <w:rPr>
+            <w:rStyle w:val="Hyperlink"/>
+            <w:rFonts w:ascii="Times New Roman" w:hAnsi="Times New Roman" w:cs="Times New Roman"/>
+          </w:rPr>
+          <w:t>https://archive.ics.uci.edu/ml/datasets/breast+cancer+wisconsin+(diagnostic)</w:t>
+        </w:r>
+      </w:hyperlink>
+    </w:p>
+    <w:p>
+      <w:pPr>
+        <w:rPr>
+          <w:rFonts w:ascii="Times New Roman" w:hAnsi="Times New Roman" w:cs="Times New Roman"/>
+        </w:rPr>
+      </w:pPr>
+      <w:r>
+        <w:rPr>
+          <w:rFonts w:ascii="Times New Roman" w:hAnsi="Times New Roman" w:cs="Times New Roman"/>
+        </w:rPr>
+        <w:t xml:space="preserve">Scikit-learn developers, "Support Vector Machines," scikit-learn documentation. Available at: </w:t>
+      </w:r>
+      <w:hyperlink r:id="rId12" w:tgtFrame="_blank" w:history="1">
+        <w:r>
+          <w:rPr>
+            <w:rStyle w:val="Hyperlink"/>
+            <w:rFonts w:ascii="Times New Roman" w:hAnsi="Times New Roman" w:cs="Times New Roman"/>
+          </w:rPr>
+          <w:t>https://scikit-learn.org/stable/modules/svm.html</w:t>
+        </w:r>
+      </w:hyperlink>
+    </w:p>
+    <w:p>
+      <w:pPr>
+        <w:rPr>
+          <w:rFonts w:ascii="Times New Roman" w:hAnsi="Times New Roman" w:cs="Times New Roman"/>
+        </w:rPr>
+      </w:pPr>
+      <w:r>
+        <w:rPr>
+          <w:rFonts w:ascii="Times New Roman" w:hAnsi="Times New Roman" w:cs="Times New Roman"/>
+        </w:rPr>
+        <w:t xml:space="preserve">Scikit-learn developers, "sklearn.svm.SVC documentation." Available at: </w:t>
+      </w:r>
+      <w:hyperlink r:id="rId13" w:tgtFrame="_blank" w:history="1">
+        <w:r>
+          <w:rPr>
+            <w:rStyle w:val="Hyperlink"/>
+            <w:rFonts w:ascii="Times New Roman" w:hAnsi="Times New Roman" w:cs="Times New Roman"/>
+          </w:rPr>
+          <w:t>https://scikit-learn.org/stable/modules/generated/sklearn.svm.SVC.html</w:t>
+        </w:r>
+      </w:hyperlink>
+    </w:p>
+    <w:p>
+      <w:pPr>
+        <w:rPr>
+          <w:rFonts w:ascii="Times New Roman" w:hAnsi="Times New Roman" w:cs="Times New Roman"/>
+        </w:rPr>
+      </w:pPr>
+      <w:r>
+        <w:rPr>
+          <w:rFonts w:ascii="Times New Roman" w:hAnsi="Times New Roman" w:cs="Times New Roman"/>
+        </w:rPr>
+        <w:t xml:space="preserve">Stanford University CS229, "Support Vector Machines Lecture Notes," Andrew Ng. Available at: </w:t>
+      </w:r>
+      <w:hyperlink r:id="rId14" w:tgtFrame="_blank" w:history="1">
+        <w:r>
+          <w:rPr>
+            <w:rStyle w:val="Hyperlink"/>
+            <w:rFonts w:ascii="Times New Roman" w:hAnsi="Times New Roman" w:cs="Times New Roman"/>
+          </w:rPr>
+          <w:t>https://cs229.stanford.edu/notes2022fall/main_notes.pdf</w:t>
+        </w:r>
+      </w:hyperlink>
     </w:p>
     <w:sectPr>
       <w:pgSz w:w="12240" w:h="15840"/>
@@ -5311,7 +6186,6 @@
   <w:style w:type="character" w:default="1" w:styleId="DefaultParagraphFont">
     <w:name w:val="Default Paragraph Font"/>
     <w:uiPriority w:val="1"/>
-    <w:semiHidden/>
     <w:unhideWhenUsed/>
   </w:style>
   <w:style w:type="table" w:default="1" w:styleId="TableNormal">
@@ -5688,6 +6562,41 @@
       </w:tblBorders>
     </w:tblPr>
   </w:style>
+  <w:style w:type="character" w:styleId="Hyperlink">
+    <w:name w:val="Hyperlink"/>
+    <w:basedOn w:val="DefaultParagraphFont"/>
+    <w:uiPriority w:val="99"/>
+    <w:unhideWhenUsed/>
+    <w:rsid w:val="00D2393C"/>
+    <w:rPr>
+      <w:color w:val="467886" w:themeColor="hyperlink"/>
+      <w:u w:val="single"/>
+    </w:rPr>
+  </w:style>
+  <w:style w:type="character" w:styleId="UnresolvedMention">
+    <w:name w:val="Unresolved Mention"/>
+    <w:basedOn w:val="DefaultParagraphFont"/>
+    <w:uiPriority w:val="99"/>
+    <w:semiHidden/>
+    <w:unhideWhenUsed/>
+    <w:rsid w:val="00D2393C"/>
+    <w:rPr>
+      <w:color w:val="605E5C"/>
+      <w:shd w:val="clear" w:color="auto" w:fill="E1DFDD"/>
+    </w:rPr>
+  </w:style>
+  <w:style w:type="character" w:styleId="FollowedHyperlink">
+    <w:name w:val="FollowedHyperlink"/>
+    <w:basedOn w:val="DefaultParagraphFont"/>
+    <w:uiPriority w:val="99"/>
+    <w:semiHidden/>
+    <w:unhideWhenUsed/>
+    <w:rsid w:val="00D2393C"/>
+    <w:rPr>
+      <w:color w:val="96607D" w:themeColor="followedHyperlink"/>
+      <w:u w:val="single"/>
+    </w:rPr>
+  </w:style>
 </w:styles>
 </file>
 

</xml_diff>